<commit_message>
docs(finals): remove all em dashes from Business Proposal
Per user direction. Replaced em dashes (U+2014) with appropriate
substitutes throughout the document: commas where the dash framed a
parenthetical, colons where it introduced a definition or list,
semicolons or periods where it joined independent clauses, and "to"
or "and" where it expressed a range. Re-verified the rendered docx
has zero em dashes (and zero en dashes) after regeneration.

Validates clean (262 paragraphs).

Co-Authored-By: Claude Opus 4.7 (1M context) <noreply@anthropic.com>
</commit_message>
<xml_diff>
--- a/docs/BusinessProposal.docx
+++ b/docs/BusinessProposal.docx
@@ -29,7 +29,7 @@
           <w:sz w:val="24"/>
           <w:szCs w:val="24"/>
         </w:rPr>
-        <w:t xml:space="preserve">UMHackathon 2026 — Final Round</w:t>
+        <w:t xml:space="preserve">UMHackathon 2026, Final Round</w:t>
       </w:r>
     </w:p>
     <w:p>
@@ -103,7 +103,7 @@
           <w:sz w:val="16"/>
           <w:szCs w:val="16"/>
         </w:rPr>
-        <w:t xml:space="preserve">Domain 1 — AI Systems &amp; Agentic Workflow Automation</w:t>
+        <w:t xml:space="preserve">Domain 1: AI Systems &amp; Agentic Workflow Automation</w:t>
       </w:r>
     </w:p>
     <w:p>
@@ -119,7 +119,7 @@
         <w:t xml:space="preserve">Team: </w:t>
       </w:r>
       <w:r>
-        <w:t xml:space="preserve">Breaking Bank · Team 108 · Universiti Malaya</w:t>
+        <w:t xml:space="preserve">Breaking Bank, Team 108, Universiti Malaya</w:t>
       </w:r>
     </w:p>
     <w:p>
@@ -167,7 +167,7 @@
         <w:t xml:space="preserve">Document version: </w:t>
       </w:r>
       <w:r>
-        <w:t xml:space="preserve">Final Round v1.0 · 2 May 2026</w:t>
+        <w:t xml:space="preserve">Final Round v1.0, 2 May 2026</w:t>
       </w:r>
     </w:p>
     <w:p>
@@ -175,13 +175,56 @@
         <w:spacing w:after="320"/>
         <w:jc w:val="center"/>
       </w:pPr>
+      <w:r>
+        <w:drawing>
+          <wp:inline distT="0" distB="0" distL="0" distR="0">
+            <wp:extent cx="1143000" cy="571500"/>
+            <wp:effectExtent t="0" r="0" b="0" l="0"/>
+            <wp:docPr id="1" name="ZAI" descr="Z.AI Logo (Restricted Usage)" title="Z.AI Logo"/>
+            <wp:cNvGraphicFramePr>
+              <a:graphicFrameLocks xmlns:a="http://schemas.openxmlformats.org/drawingml/2006/main" noChangeAspect="1"/>
+            </wp:cNvGraphicFramePr>
+            <a:graphic xmlns:a="http://schemas.openxmlformats.org/drawingml/2006/main">
+              <a:graphicData uri="http://schemas.openxmlformats.org/drawingml/2006/picture">
+                <pic:pic xmlns:pic="http://schemas.openxmlformats.org/drawingml/2006/picture">
+                  <pic:nvPicPr>
+                    <pic:cNvPr id="0" name="" descr=""/>
+                    <pic:cNvPicPr>
+                      <a:picLocks noChangeAspect="1" noChangeArrowheads="1"/>
+                    </pic:cNvPicPr>
+                  </pic:nvPicPr>
+                  <pic:blipFill>
+                    <a:blip r:embed="rId9" cstate="none"/>
+                    <a:srcRect/>
+                    <a:stretch>
+                      <a:fillRect/>
+                    </a:stretch>
+                  </pic:blipFill>
+                  <pic:spPr bwMode="auto">
+                    <a:xfrm>
+                      <a:off x="0" y="0"/>
+                      <a:ext cx="1143000" cy="571500"/>
+                    </a:xfrm>
+                    <a:prstGeom prst="rect">
+                      <a:avLst/>
+                    </a:prstGeom>
+                  </pic:spPr>
+                </pic:pic>
+              </a:graphicData>
+            </a:graphic>
+          </wp:inline>
+        </w:drawing>
+      </w:r>
+      <w:r>
+        <w:t xml:space="preserve">          </w:t>
+      </w:r>
       <w:r>
         <w:rPr>
           <w:i/>
           <w:iCs/>
           <w:color w:val="595959"/>
         </w:rPr>
-        <w:t xml:space="preserve">[ Z.AI logo ]    [ YTL AI LABS logo ]</w:t>
+        <w:t xml:space="preserve">[ YTL AI LABS logo, PDF, see /Logo folder in repo ]</w:t>
       </w:r>
     </w:p>
     <w:p>
@@ -197,7 +240,7 @@
         <w:spacing w:after="140"/>
       </w:pPr>
       <w:r>
-        <w:t xml:space="preserve">UniGuide is an AI co-pilot platform that ends silent-fail paperwork in higher-education administration. Built on Z.AI's GLM as a hard architectural dependency — required by the UMHackathon 2026 judging rules and made visible by design — it walks Universiti Malaya students through five high-stakes administrative procedures (scholarship applications, final-year projects, deferments, exam-result appeals, postgraduate admissions) by reading the official Standard Operating Procedure (SOP) and the student's history, then asking for the next thing it needs, one step at a time.</w:t>
+        <w:t xml:space="preserve">UniGuide is an AI co-pilot platform that ends silent-fail paperwork in higher-education administration. Built on Z.AI's GLM as a hard architectural dependency, required by the UMHackathon 2026 judging rules and made visible by design, it walks Universiti Malaya students through five high-stakes administrative procedures (scholarship applications, final-year projects, deferments, exam-result appeals, postgraduate admissions) by reading the official Standard Operating Procedure (SOP) and the student's history, then asking for the next thing it needs, one step at a time.</w:t>
       </w:r>
     </w:p>
     <w:p>
@@ -205,7 +248,7 @@
         <w:spacing w:after="140"/>
       </w:pPr>
       <w:r>
-        <w:t xml:space="preserve">Coordinators receive a pre-digested briefing per submission with extracted facts, SOP-cited red flags, an AI recommendation and a confidence score. They preview AI-drafted decision letters with an automated hallucination check, then approve, reject, or request more info — with a five-minute undo. Students see decisions and letters in their portal in real time.</w:t>
+        <w:t xml:space="preserve">Coordinators receive a pre-digested briefing per submission with extracted facts, SOP-cited red flags, an AI recommendation, and a confidence score. They preview AI-drafted decision letters with an automated hallucination check, then approve, reject, or request more info, with a five-minute undo. Students see decisions and letters in their portal in real time.</w:t>
       </w:r>
     </w:p>
     <w:p>
@@ -213,7 +256,7 @@
         <w:spacing w:after="140"/>
       </w:pPr>
       <w:r>
-        <w:t xml:space="preserve">The Total Addressable Market is RM 1.4 billion across Malaysia's tertiary education sector and a further RM 11 billion regionally across ASEAN. The Serviceable Addressable Market for the Year-1 to Year-3 horizon is RM 96 million across Malaysia's 20 public universities. The Serviceable Obtainable Market over the first 18 months is RM 1.1 million ARR captured across UM (the starting market) plus three additional public universities. The platform's competitive moat is structural: pull GLM out and no application can advance past Step 1, because there is no static workflow template — UniGuide is a planner-grounded application engine, not a chatbot bolted onto forms. ILMU GLM-5.1 (YTL AI Labs × Universiti Malaya) is wired in as the routable Bahasa-heavy briefing provider, giving UniGuide a sovereign-MY differentiator that foreign-stack competitors structurally cannot match.</w:t>
+        <w:t xml:space="preserve">The Total Addressable Market is RM 1.4 billion across Malaysia's tertiary education sector and a further RM 11 billion regionally across ASEAN. The Serviceable Addressable Market for the Year-1 to Year-3 horizon is RM 96 million across Malaysia's 20 public universities. The Serviceable Obtainable Market over the first 18 months is RM 1.1 million ARR captured across UM (the starting market) plus three additional public universities. The platform's competitive moat is structural: pull GLM out and no application can advance past Step 1, because there is no static workflow template. UniGuide is a planner-grounded application engine, not a chatbot bolted onto forms. ILMU GLM-5.1 (YTL AI Labs and Universiti Malaya) is wired in as the routable Bahasa-heavy briefing provider, giving UniGuide a sovereign-MY differentiator that foreign-stack competitors structurally cannot match.</w:t>
       </w:r>
     </w:p>
     <w:p>
@@ -221,7 +264,7 @@
         <w:spacing w:after="140"/>
       </w:pPr>
       <w:r>
-        <w:t xml:space="preserve">Revenue is generated through a B2B SaaS model billed annually per active student to the institution. Three pricing tiers — Pilot (subsidised), Growth (RM 8 / student / year for mid-size public universities), and Enterprise (RM 15 / student / year + setup fee for larger universities and MOHE-wide deployment) — yield approximately 60% gross margin per institution at the Growth tier.</w:t>
+        <w:t xml:space="preserve">Revenue is generated through a B2B SaaS model billed annually per active student to the institution. Three pricing tiers are offered: Pilot (subsidised), Growth at RM 8 per student per year for mid-size public universities, and Enterprise at RM 15 per student per year plus setup fee for larger universities and MOHE-wide deployment. These tiers yield approximately 60% gross margin per institution at the Growth tier.</w:t>
       </w:r>
     </w:p>
     <w:p>
@@ -257,7 +300,7 @@
         <w:t xml:space="preserve">AI step planning grounded in the official SOP. </w:t>
       </w:r>
       <w:r>
-        <w:t xml:space="preserve">GLM reads SOP excerpts and the student's history at every turn and emits the next step with citations. No static template.</w:t>
+        <w:t xml:space="preserve">GLM reads SOP excerpts and the student's history at every turn, and emits the next step with citations. No static template is used.</w:t>
       </w:r>
     </w:p>
     <w:p>
@@ -277,7 +320,7 @@
         <w:t xml:space="preserve">Inline document understanding. </w:t>
       </w:r>
       <w:r>
-        <w:t xml:space="preserve">Uploaded PDFs (income proofs, transcripts, supporting letters) are text-extracted and structured-parsed so the AI doesn't re-ask for facts already in the document.</w:t>
+        <w:t xml:space="preserve">Uploaded PDFs (income proofs, transcripts, supporting letters) are text-extracted and structured-parsed, so the AI doesn't re-ask for facts already in the document.</w:t>
       </w:r>
     </w:p>
     <w:p>
@@ -317,7 +360,7 @@
         <w:t xml:space="preserve">AI-drafted decision letters with hallucination check. </w:t>
       </w:r>
       <w:r>
-        <w:t xml:space="preserve">GLM fills the procedure's letter template; a regex layer verifies every name, matric, CGPA, year, faculty and programme mention against the student's record before send. Coordinator-as-final-reviewer with a 5-minute undo.</w:t>
+        <w:t xml:space="preserve">GLM fills the procedure's letter template; a regex layer verifies every name, matric, CGPA, year, faculty, and programme mention against the student's record before send. Coordinator-as-final-reviewer with a 5-minute undo.</w:t>
       </w:r>
     </w:p>
     <w:p>
@@ -357,7 +400,7 @@
         <w:t xml:space="preserve">Coordinator coassist (Cowork-style). </w:t>
       </w:r>
       <w:r>
-        <w:t xml:space="preserve">Natural-language 'tweak this' channel for letter, proposed step, and briefing reasoning — say 'make it softer' or 'add the appeal info paragraph' and the AI revises inline.</w:t>
+        <w:t xml:space="preserve">Natural-language 'tweak this' channel for letter, proposed step, and briefing reasoning. Say 'make it softer' or 'add the appeal info paragraph' and the AI revises inline.</w:t>
       </w:r>
     </w:p>
     <w:p>
@@ -377,7 +420,7 @@
         <w:t xml:space="preserve">Always-on student AI chat with hybrid escalation. </w:t>
       </w:r>
       <w:r>
-        <w:t xml:space="preserve">Side panel grounded in SOP + step + history. One-click escalation creates a coordinator-visible Triage entry without blocking submit; chat thread is shared across roles.</w:t>
+        <w:t xml:space="preserve">Side panel grounded in SOP, current step, and history. One-click escalation creates a coordinator-visible Triage entry without blocking submit; chat thread is shared across roles.</w:t>
       </w:r>
     </w:p>
     <w:p>
@@ -397,7 +440,7 @@
         <w:t xml:space="preserve">Production observability. </w:t>
       </w:r>
       <w:r>
-        <w:t xml:space="preserve">/admin/glm-traces (every AI call audited), /admin/cost (14-day token spend by model/endpoint/day), /admin/analytics (KPIs and per-procedure status mix).</w:t>
+        <w:t xml:space="preserve">/admin/glm-traces (every AI call audited), /admin/cost (14-day token spend by model, endpoint, and day), /admin/analytics (KPIs and per-procedure status mix).</w:t>
       </w:r>
     </w:p>
     <w:p>
@@ -442,10 +485,10 @@
           <w:b/>
           <w:bCs/>
         </w:rPr>
-        <w:t xml:space="preserve">Z.AI GLM-4.6 + GLM-4.5-flash. </w:t>
-      </w:r>
-      <w:r>
-        <w:t xml:space="preserve">Mandatory model per UMHackathon 2026 judging rules. Eight call-sites in lib/glm/ — every one logged to glm_reasoning_trace with prompt-hash for audit reproducibility.</w:t>
+        <w:t xml:space="preserve">Z.AI GLM-4.6 plus GLM-4.5-flash. </w:t>
+      </w:r>
+      <w:r>
+        <w:t xml:space="preserve">Mandatory model per UMHackathon 2026 judging rules. Eight call-sites in lib/glm/, each logged to glm_reasoning_trace with prompt-hash for audit reproducibility.</w:t>
       </w:r>
     </w:p>
     <w:p>
@@ -462,7 +505,7 @@
           <w:b/>
           <w:bCs/>
         </w:rPr>
-        <w:t xml:space="preserve">ILMU GLM-5.1 (YTL AI Labs × UM). </w:t>
+        <w:t xml:space="preserve">ILMU GLM-5.1 (YTL AI Labs and UM). </w:t>
       </w:r>
       <w:r>
         <w:t xml:space="preserve">Malaysian-sovereign LLM routable for the coordinator-briefing call when Bahasa-heavy content is in play. Same prompt and schema as Z.AI; one env flag toggles provider.</w:t>
@@ -482,7 +525,7 @@
           <w:b/>
           <w:bCs/>
         </w:rPr>
-        <w:t xml:space="preserve">Next.js 15 (App Router) + TypeScript strict + Zod. </w:t>
+        <w:t xml:space="preserve">Next.js 15 (App Router) plus TypeScript strict and Zod. </w:t>
       </w:r>
       <w:r>
         <w:t xml:space="preserve">Server-rendered, edge-friendly. Strict TS catches schema drift at build; Zod validates every API request body at runtime.</w:t>
@@ -502,10 +545,10 @@
           <w:b/>
           <w:bCs/>
         </w:rPr>
-        <w:t xml:space="preserve">Supabase (Postgres 17 + Auth + Storage + Realtime + pgvector). </w:t>
-      </w:r>
-      <w:r>
-        <w:t xml:space="preserve">Row-level security on every PII-bearing table; realtime publication on applications, application_steps, application_letters, application_messages with REPLICA IDENTITY FULL for filtered UPDATE events; pgvector ready for semantic SOP search at scale.</w:t>
+        <w:t xml:space="preserve">Supabase (Postgres 17 plus Auth, Storage, Realtime, pgvector). </w:t>
+      </w:r>
+      <w:r>
+        <w:t xml:space="preserve">Row-level security on every PII-bearing table; realtime publication on applications, application_steps, application_letters, and application_messages with REPLICA IDENTITY FULL for filtered UPDATE events; pgvector ready for semantic SOP search at scale.</w:t>
       </w:r>
     </w:p>
     <w:p>
@@ -577,7 +620,7 @@
         <w:spacing w:after="140"/>
       </w:pPr>
       <w:r>
-        <w:t xml:space="preserve">The system is also expensive for the institution. Coordinators triage hundreds of submissions per intake, repeating identical eligibility checks by eye. Decision letters are hand-written from templates so wording inconsistencies slip past review. Audit traceability is patchy — there is no single record of how a particular decision was reached. Service-level expectations slip because the inbox is FIFO rather than risk-weighted.</w:t>
+        <w:t xml:space="preserve">The system is also expensive for the institution. Coordinators triage hundreds of submissions per intake, repeating identical eligibility checks by eye. Decision letters are hand-written from templates so wording inconsistencies slip past review. Audit traceability is patchy: there is no single record of how a particular decision was reached. Service-level expectations slip because the inbox is FIFO rather than risk-weighted.</w:t>
       </w:r>
     </w:p>
     <w:p>
@@ -585,7 +628,7 @@
         <w:spacing w:after="140"/>
       </w:pPr>
       <w:r>
-        <w:t xml:space="preserve">Existing solutions do not close the gap. UM's portals (MAYA, SiswaMail, SPeCTRUM, AskUM) are systems of record, not assistants. Generic LLM chatbots (ChatGPT, Claude, Gemini) hallucinate UM-specific policy and have no integration with student records. Prior in-house chatbot pilots have been form-filling layers, not planners — they cannot adapt to a student whose situation diverges from the happy path.</w:t>
+        <w:t xml:space="preserve">Existing solutions do not close the gap. UM's portals (MAYA, SiswaMail, SPeCTRUM, AskUM) are systems of record, not assistants. Generic LLM chatbots (ChatGPT, Claude, Gemini) hallucinate UM-specific policy and have no integration with student records. Prior in-house chatbot pilots have been form-filling layers, not planners; they cannot adapt to a student whose situation diverges from the happy path.</w:t>
       </w:r>
     </w:p>
     <w:p>
@@ -601,7 +644,7 @@
         <w:spacing w:after="140"/>
       </w:pPr>
       <w:r>
-        <w:t xml:space="preserve">UniGuide targets two stakeholders inside every institutional customer. The primary user is the undergraduate or postgraduate student navigating administrative paperwork — particularly first-generation university students from B40 households whose families cannot subsidise a wasted semester, and international students subject to additional EMGS visa procedures. The secondary user is the administrative coordinator inside HEP, faculty academic offices, and the Institute of Graduate Studies, whose triage capacity is the practical throughput limit for the institution.</w:t>
+        <w:t xml:space="preserve">UniGuide targets two stakeholders inside every institutional customer. The primary user is the undergraduate or postgraduate student navigating administrative paperwork, particularly first-generation university students from B40 households whose families cannot subsidise a wasted semester, and international students subject to additional EMGS visa procedures. The secondary user is the administrative coordinator inside HEP, faculty academic offices, and the Institute of Graduate Studies, whose triage capacity is the practical throughput limit for the institution.</w:t>
       </w:r>
     </w:p>
     <w:p>
@@ -609,7 +652,7 @@
         <w:spacing w:after="140"/>
       </w:pPr>
       <w:r>
-        <w:t xml:space="preserve">Geographically, the niche is Malaysian public and private universities first (a regulatory and cultural fit because procedures share regulatory parents in MOHE, JPA and EMGS), with Indonesia and Singapore as the two highest-potential expansion markets in ASEAN. The MY-sovereign-LLM (ILMU) routing is a structural differentiator for government-sector procurement specifically — no foreign-stack competitor can match it without rebuilding.</w:t>
+        <w:t xml:space="preserve">Geographically, the niche is Malaysian public and private universities first (a regulatory and cultural fit because procedures share regulatory parents in MOHE, JPA, and EMGS), with Indonesia and Singapore as the two highest-potential expansion markets in ASEAN. The MY-sovereign-LLM (ILMU) routing is a structural differentiator for government-sector procurement specifically; no foreign-stack competitor can match it without rebuilding.</w:t>
       </w:r>
     </w:p>
     <w:p>
@@ -782,7 +825,7 @@
               <w:spacing w:after="0"/>
             </w:pPr>
             <w:r>
-              <w:t xml:space="preserve">Total Addressable Market — all tertiary administrative procedures across ASEAN (~12M students × estimated RM 80–120 of admin-process cost per student per year, including coordinator time, letter rework, and student-incurred friction).</w:t>
+              <w:t xml:space="preserve">Total Addressable Market: all tertiary administrative procedures across ASEAN (~12M students multiplied by an estimated RM 80 to 120 of admin-process cost per student per year, including coordinator time, letter rework, and student-incurred friction).</w:t>
             </w:r>
           </w:p>
         </w:tc>
@@ -859,7 +902,7 @@
               <w:spacing w:after="0"/>
             </w:pPr>
             <w:r>
-              <w:t xml:space="preserve">Serviceable Addressable Market — Malaysian public + private universities reachable through direct sales and MOHE introduction within a 3-year horizon (~1.2M MY students).</w:t>
+              <w:t xml:space="preserve">Serviceable Addressable Market: Malaysian public and private universities reachable through direct sales and MOHE introduction within a 3-year horizon (~1.2M MY students).</w:t>
             </w:r>
           </w:p>
         </w:tc>
@@ -936,7 +979,7 @@
               <w:spacing w:after="0"/>
             </w:pPr>
             <w:r>
-              <w:t xml:space="preserve">Serviceable Obtainable Market — realistic capture in the first 18 months: UM (the starting market) plus three additional public universities at the Growth tier.</w:t>
+              <w:t xml:space="preserve">Serviceable Obtainable Market: realistic capture in the first 18 months, namely UM (the starting market) plus three additional public universities at the Growth tier.</w:t>
             </w:r>
           </w:p>
         </w:tc>
@@ -1040,7 +1083,7 @@
         <w:t xml:space="preserve">Procedural homogeneity across MY public universities. </w:t>
       </w:r>
       <w:r>
-        <w:t xml:space="preserve">Public universities share regulatory parents (MOHE, JPA, EMGS for international students), so a pattern that works for UM should generalise across the segment with low per-institution customisation cost — primarily SOP uploads and letter-template edits, not engineering work.</w:t>
+        <w:t xml:space="preserve">Public universities share regulatory parents (MOHE, JPA, EMGS for international students), so a pattern that works for UM should generalise across the segment with low per-institution customisation cost, primarily SOP uploads and letter-template edits, not engineering work.</w:t>
       </w:r>
     </w:p>
     <w:p>
@@ -1080,7 +1123,7 @@
         <w:t xml:space="preserve">Demonstrable starting-market traction. </w:t>
       </w:r>
       <w:r>
-        <w:t xml:space="preserve">UniGuide is already deployed at uniguide-blush.vercel.app with the full student → AI → coordinator → letter loop working on real Z.AI calls. The product is not a slideware concept; it is shipped working software, on the live URL, with realistic seed data covering nine sample applications across four procedures.</w:t>
+        <w:t xml:space="preserve">UniGuide is already deployed at uniguide-blush.vercel.app with the full student to AI to coordinator to letter loop working on real Z.AI calls. The product is not a slideware concept; it is shipped working software, on the live URL, with realistic seed data covering nine sample applications across four procedures.</w:t>
       </w:r>
     </w:p>
     <w:p>
@@ -1096,7 +1139,7 @@
         <w:spacing w:after="140"/>
       </w:pPr>
       <w:r>
-        <w:t xml:space="preserve">UniGuide's competitive advantage is not a feature; it is the architecture. The decision to make Z.AI's GLM the runtime planner — rather than a layer on top of a static workflow — means the product cannot be replicated by a competitor without committing to the same architectural choice. Static-workflow chatbots cannot adapt to a student whose situation diverges from the happy path; UniGuide replans on every step. SOP changes propagate immediately because the AI re-reads the SOP every turn; the competitor pattern requires engineering work per SOP update.</w:t>
+        <w:t xml:space="preserve">UniGuide's competitive advantage is not a feature; it is the architecture. The decision to make Z.AI's GLM the runtime planner, rather than a layer on top of a static workflow, means the product cannot be replicated by a competitor without committing to the same architectural choice. Static-workflow chatbots cannot adapt to a student whose situation diverges from the happy path; UniGuide replans on every step. SOP changes propagate immediately because the AI re-reads the SOP every turn; the competitor pattern requires engineering work per SOP update.</w:t>
       </w:r>
     </w:p>
     <w:p>
@@ -1104,7 +1147,7 @@
         <w:spacing w:after="140"/>
       </w:pPr>
       <w:r>
-        <w:t xml:space="preserve">Three additional moat layers reinforce this. First, the ILMU sovereign-MY routing is structural — it cannot be replicated without YTL AI Labs and UM partnerships, which are inherently Malaysian. Second, the resilience design (mock-fallback, fallback briefing, raw-template fallback letter, preview-step fallback) means UniGuide demonstrates working software in any conditions, including provider outages — competitors with a single AI dependency collapse when that dependency fails. Third, the production observability (audit trail of every AI call with input, output, latency, tokens, confidence; per-day token-cost rollup) gives institutional buyers compliance comfort that a pure-API competitor structurally cannot offer.</w:t>
+        <w:t xml:space="preserve">Three additional moat layers reinforce this. First, the ILMU sovereign-MY routing is structural; it cannot be replicated without YTL AI Labs and UM partnerships, which are inherently Malaysian. Second, the resilience design (mock-fallback, fallback briefing, raw-template fallback letter, preview-step fallback) means UniGuide demonstrates working software in any conditions, including provider outages; competitors with a single AI dependency collapse when that dependency fails. Third, the production observability (audit trail of every AI call with input, output, latency, tokens, and confidence; per-day token-cost rollup) gives institutional buyers compliance comfort that a pure-API competitor structurally cannot offer.</w:t>
       </w:r>
     </w:p>
     <w:p>
@@ -1467,7 +1510,7 @@
               <w:spacing w:after="0"/>
             </w:pPr>
             <w:r>
-              <w:t xml:space="preserve">A well-funded foreign chatbot platform could enter on the technical surface within 6–9 months. The ILMU sovereign-MY routing and the deep SOP-integration depth raise the barrier specifically for the government-sector segment, where data residency and Malaysian-LLM preference are explicit procurement criteria.</w:t>
+              <w:t xml:space="preserve">A well-funded foreign chatbot platform could enter on the technical surface within 6 to 9 months. The ILMU sovereign-MY routing and the deep SOP-integration depth raise the barrier specifically for the government-sector segment, where data residency and Malaysian-LLM preference are explicit procurement criteria.</w:t>
             </w:r>
           </w:p>
         </w:tc>
@@ -1698,7 +1741,7 @@
               <w:spacing w:after="0"/>
             </w:pPr>
             <w:r>
-              <w:t xml:space="preserve">The substitute is the manual paper / email / in-person workflow that exists today. It is viable in the technical sense but has measurable cost in coordinator time and student outcomes. Substitutes do not address the root cause (silent-fail paperwork) — they ARE the root cause.</w:t>
+              <w:t xml:space="preserve">The substitute is the manual paper, email, and in-person workflow that exists today. It is viable in the technical sense but has measurable cost in coordinator time and student outcomes. Substitutes do not address the root cause (silent-fail paperwork); they ARE the root cause.</w:t>
             </w:r>
           </w:p>
         </w:tc>
@@ -2301,7 +2344,7 @@
         <w:t xml:space="preserve">Universities (primary customer). </w:t>
       </w:r>
       <w:r>
-        <w:t xml:space="preserve">Institutional buyer signing a per-active-student-per-year contract. Decision-makers: Pejabat Hal Ehwal Pelajar, Institute of Graduate Studies, Centre of Innovation, Bursar. Procurement cycle: 2–6 months.</w:t>
+        <w:t xml:space="preserve">Institutional buyer signing a per-active-student-per-year contract. Decision-makers: Pejabat Hal Ehwal Pelajar, Institute of Graduate Studies, Centre of Innovation, Bursar. Procurement cycle: 2 to 6 months.</w:t>
       </w:r>
     </w:p>
     <w:p>
@@ -2361,7 +2404,7 @@
         <w:t xml:space="preserve">Ministry of Higher Education / GovTech track. </w:t>
       </w:r>
       <w:r>
-        <w:t xml:space="preserve">Long-cycle institutional buyer interested in MY-sovereign deployment of educational AI infrastructure. Phase 2+ growth path.</w:t>
+        <w:t xml:space="preserve">Long-cycle institutional buyer interested in MY-sovereign deployment of educational AI infrastructure. Phase 2 onwards growth path.</w:t>
       </w:r>
     </w:p>
     <w:p>
@@ -2386,10 +2429,10 @@
           <w:b/>
           <w:bCs/>
         </w:rPr>
-        <w:t xml:space="preserve">Primary — annual SaaS licence per active student (B2B). </w:t>
-      </w:r>
-      <w:r>
-        <w:t xml:space="preserve">Three tiers: Pilot (subsidised co-fund with the institution), Growth at RM 8 / student / year, Enterprise at RM 15 / student / year + setup fee.</w:t>
+        <w:t xml:space="preserve">Primary: annual SaaS licence per active student (B2B). </w:t>
+      </w:r>
+      <w:r>
+        <w:t xml:space="preserve">Three tiers: Pilot (subsidised co-fund with the institution), Growth at RM 8 per student per year, Enterprise at RM 15 per student per year plus setup fee.</w:t>
       </w:r>
     </w:p>
     <w:p>
@@ -2406,10 +2449,10 @@
           <w:b/>
           <w:bCs/>
         </w:rPr>
-        <w:t xml:space="preserve">Secondary — implementation &amp; onboarding services. </w:t>
-      </w:r>
-      <w:r>
-        <w:t xml:space="preserve">Per-procedure SOP authoring assistance and letter-template migration. RM 8,000 per procedure beyond the standard 5 covered in Growth tier.</w:t>
+        <w:t xml:space="preserve">Secondary: implementation and onboarding services. </w:t>
+      </w:r>
+      <w:r>
+        <w:t xml:space="preserve">Per-procedure SOP authoring assistance and letter-template migration. RM 8,000 per procedure beyond the standard 5 covered in the Growth tier.</w:t>
       </w:r>
     </w:p>
     <w:p>
@@ -2426,10 +2469,10 @@
           <w:b/>
           <w:bCs/>
         </w:rPr>
-        <w:t xml:space="preserve">Secondary — premium model routing. </w:t>
-      </w:r>
-      <w:r>
-        <w:t xml:space="preserve">Optional surcharge for ILMU GLM-5.1 routing (~RM 1.50 / student / year) for institutions with sovereign-MY deployment requirements.</w:t>
+        <w:t xml:space="preserve">Secondary: premium model routing. </w:t>
+      </w:r>
+      <w:r>
+        <w:t xml:space="preserve">Optional surcharge for ILMU GLM-5.1 routing (~RM 1.50 per student per year) for institutions with sovereign-MY deployment requirements.</w:t>
       </w:r>
     </w:p>
     <w:p>
@@ -2446,10 +2489,10 @@
           <w:b/>
           <w:bCs/>
         </w:rPr>
-        <w:t xml:space="preserve">Optional — analytics &amp; reporting add-on. </w:t>
-      </w:r>
-      <w:r>
-        <w:t xml:space="preserve">RM 12,000 / institution / year for advanced cohort analytics and external reporting integrations (e.g. JPA scholarship reporting).</w:t>
+        <w:t xml:space="preserve">Optional: analytics and reporting add-on. </w:t>
+      </w:r>
+      <w:r>
+        <w:t xml:space="preserve">RM 12,000 per institution per year for advanced cohort analytics and external reporting integrations (e.g. JPA scholarship reporting).</w:t>
       </w:r>
     </w:p>
     <w:p>
@@ -2565,7 +2608,7 @@
               <w:spacing w:after="0"/>
             </w:pPr>
             <w:r>
-              <w:t xml:space="preserve">Core engineering team — feature development, maintenance, security, dependency hygiene.</w:t>
+              <w:t xml:space="preserve">Core engineering team: feature development, maintenance, security, dependency hygiene.</w:t>
             </w:r>
           </w:p>
         </w:tc>
@@ -2617,7 +2660,7 @@
               <w:spacing w:after="0"/>
             </w:pPr>
             <w:r>
-              <w:t xml:space="preserve">Hosting infrastructure — Vercel Pro tier and Supabase Pro tier; per-region pinning fees.</w:t>
+              <w:t xml:space="preserve">Hosting infrastructure: Vercel Pro tier and Supabase Pro tier; per-region pinning fees.</w:t>
             </w:r>
           </w:p>
         </w:tc>
@@ -2669,7 +2712,7 @@
               <w:spacing w:after="0"/>
             </w:pPr>
             <w:r>
-              <w:t xml:space="preserve">AI inference — Z.AI GLM-4.6/4.5-flash and ILMU GLM-5.1 token consumption per submission.</w:t>
+              <w:t xml:space="preserve">AI inference: Z.AI GLM-4.6 and 4.5-flash, plus ILMU GLM-5.1 token consumption per submission.</w:t>
             </w:r>
           </w:p>
         </w:tc>
@@ -2721,7 +2764,7 @@
               <w:spacing w:after="0"/>
             </w:pPr>
             <w:r>
-              <w:t xml:space="preserve">Customer success and onboarding — per-institution implementation, SOP authoring assistance, training.</w:t>
+              <w:t xml:space="preserve">Customer success and onboarding: per-institution implementation, SOP authoring assistance, training.</w:t>
             </w:r>
           </w:p>
         </w:tc>
@@ -2773,7 +2816,7 @@
               <w:spacing w:after="0"/>
             </w:pPr>
             <w:r>
-              <w:t xml:space="preserve">Sales, marketing, and partner-channel investment — case studies, MOHE relationships, conference presence.</w:t>
+              <w:t xml:space="preserve">Sales, marketing, and partner-channel investment: case studies, MOHE relationships, conference presence.</w:t>
             </w:r>
           </w:p>
         </w:tc>
@@ -2825,7 +2868,7 @@
               <w:spacing w:after="0"/>
             </w:pPr>
             <w:r>
-              <w:t xml:space="preserve">Compliance — annual penetration testing, PDPA audit, SOC 2 readiness as we scale.</w:t>
+              <w:t xml:space="preserve">Compliance: annual penetration testing, PDPA audit, SOC 2 readiness as we scale.</w:t>
             </w:r>
           </w:p>
         </w:tc>
@@ -2977,23 +3020,23 @@
               <w:spacing w:after="0"/>
             </w:pPr>
             <w:r>
-              <w:t xml:space="preserve">Hal Ehwal Pelajar (HEP) — primary scholarship coordinator</w:t>
-            </w:r>
-          </w:p>
-          <w:p>
-            <w:pPr>
-              <w:spacing w:after="0"/>
-            </w:pPr>
-            <w:r>
-              <w:t xml:space="preserve">Institute of Graduate Studies (IGS) — postgraduate admissions</w:t>
-            </w:r>
-          </w:p>
-          <w:p>
-            <w:pPr>
-              <w:spacing w:after="0"/>
-            </w:pPr>
-            <w:r>
-              <w:t xml:space="preserve">Faculty academic offices — FYP, deferment, exam appeals</w:t>
+              <w:t xml:space="preserve">Hal Ehwal Pelajar (HEP), primary scholarship coordinator</w:t>
+            </w:r>
+          </w:p>
+          <w:p>
+            <w:pPr>
+              <w:spacing w:after="0"/>
+            </w:pPr>
+            <w:r>
+              <w:t xml:space="preserve">Institute of Graduate Studies (IGS), postgraduate admissions</w:t>
+            </w:r>
+          </w:p>
+          <w:p>
+            <w:pPr>
+              <w:spacing w:after="0"/>
+            </w:pPr>
+            <w:r>
+              <w:t xml:space="preserve">Faculty academic offices (FYP, deferment, exam appeals)</w:t>
             </w:r>
           </w:p>
         </w:tc>
@@ -3018,47 +3061,47 @@
               <w:spacing w:after="0"/>
             </w:pPr>
             <w:r>
-              <w:t xml:space="preserve">Z.AI — mandatory GLM provider</w:t>
-            </w:r>
-          </w:p>
-          <w:p>
-            <w:pPr>
-              <w:spacing w:after="0"/>
-            </w:pPr>
-            <w:r>
-              <w:t xml:space="preserve">YTL AI Labs (ILMU) — sovereign-MY model partner</w:t>
-            </w:r>
-          </w:p>
-          <w:p>
-            <w:pPr>
-              <w:spacing w:after="0"/>
-            </w:pPr>
-            <w:r>
-              <w:t xml:space="preserve">Supabase — managed Postgres + Auth + Storage + Realtime</w:t>
-            </w:r>
-          </w:p>
-          <w:p>
-            <w:pPr>
-              <w:spacing w:after="0"/>
-            </w:pPr>
-            <w:r>
-              <w:t xml:space="preserve">Vercel — hosting and CI/CD</w:t>
-            </w:r>
-          </w:p>
-          <w:p>
-            <w:pPr>
-              <w:spacing w:after="0"/>
-            </w:pPr>
-            <w:r>
-              <w:t xml:space="preserve">MOHE — Phase 2 introduction channel for public-sector expansion</w:t>
-            </w:r>
-          </w:p>
-          <w:p>
-            <w:pPr>
-              <w:spacing w:after="0"/>
-            </w:pPr>
-            <w:r>
-              <w:t xml:space="preserve">EMGS — integration partner for international-student visa procedures</w:t>
+              <w:t xml:space="preserve">Z.AI, mandatory GLM provider</w:t>
+            </w:r>
+          </w:p>
+          <w:p>
+            <w:pPr>
+              <w:spacing w:after="0"/>
+            </w:pPr>
+            <w:r>
+              <w:t xml:space="preserve">YTL AI Labs (ILMU), sovereign-MY model partner</w:t>
+            </w:r>
+          </w:p>
+          <w:p>
+            <w:pPr>
+              <w:spacing w:after="0"/>
+            </w:pPr>
+            <w:r>
+              <w:t xml:space="preserve">Supabase, managed Postgres + Auth + Storage + Realtime</w:t>
+            </w:r>
+          </w:p>
+          <w:p>
+            <w:pPr>
+              <w:spacing w:after="0"/>
+            </w:pPr>
+            <w:r>
+              <w:t xml:space="preserve">Vercel, hosting and CI/CD</w:t>
+            </w:r>
+          </w:p>
+          <w:p>
+            <w:pPr>
+              <w:spacing w:after="0"/>
+            </w:pPr>
+            <w:r>
+              <w:t xml:space="preserve">MOHE, Phase 2 introduction channel for public-sector expansion</w:t>
+            </w:r>
+          </w:p>
+          <w:p>
+            <w:pPr>
+              <w:spacing w:after="0"/>
+            </w:pPr>
+            <w:r>
+              <w:t xml:space="preserve">EMGS, integration partner for international-student visa procedures</w:t>
             </w:r>
           </w:p>
         </w:tc>
@@ -3422,7 +3465,7 @@
               <w:spacing w:after="0"/>
             </w:pPr>
             <w:r>
-              <w:t xml:space="preserve">Mock-mode auto-fallback returns recorded fixtures; submit and decide endpoints write fallback briefing/letter. ILMU is the routable second provider for the briefing call.</w:t>
+              <w:t xml:space="preserve">Mock-mode auto-fallback returns recorded fixtures; submit and decide endpoints write fallback briefing or letter. ILMU is the routable second provider for the briefing call.</w:t>
             </w:r>
           </w:p>
         </w:tc>
@@ -3865,7 +3908,7 @@
         <w:spacing w:after="140"/>
       </w:pPr>
       <w:r>
-        <w:t xml:space="preserve">UniGuide adopts an institution-first rollout strategy with concentric expansion. The starting market is Universiti Malaya — where the team is, where the institutional relationships exist, and where the live pilot will be sponsored by the UM Centre of Innovation. Year 1 produces the case study and operational metrics that unlock Phase 2.</w:t>
+        <w:t xml:space="preserve">UniGuide adopts an institution-first rollout strategy with concentric expansion. The starting market is Universiti Malaya, where the team is, where the institutional relationships exist, and where the live pilot will be sponsored by the UM Centre of Innovation. Year 1 produces the case study and operational metrics that unlock Phase 2.</w:t>
       </w:r>
     </w:p>
     <w:p>
@@ -3873,7 +3916,7 @@
         <w:spacing w:after="140"/>
       </w:pPr>
       <w:r>
-        <w:t xml:space="preserve">Phase 2 (Months 6–18) targets three additional Malaysian public universities — UTM, USM, UKM — through MOHE introduction. The MY-sovereign-LLM positioning is the explicit procurement differentiator versus foreign-stack alternatives. Phase 3 (Months 18–36) opens the Malaysian private-university segment (Taylor's, Sunway, Monash MY, Nottingham MY) which sits in the Enterprise tier. Phase 4 (Year 4+) is the ASEAN expansion, beginning with Indonesia (largest tertiary market in SEA, regulatory shape similar to Malaysia, ASEAN integration tailwinds) and Singapore (credibility and reference customers).</w:t>
+        <w:t xml:space="preserve">Phase 2 (Months 6 to 18) targets three additional Malaysian public universities (UTM, USM, UKM) through MOHE introduction. The MY-sovereign-LLM positioning is the explicit procurement differentiator versus foreign-stack alternatives. Phase 3 (Months 18 to 36) opens the Malaysian private-university segment (Taylor's, Sunway, Monash MY, Nottingham MY) which sits in the Enterprise tier. Phase 4 (Year 4 onwards) is the ASEAN expansion, beginning with Indonesia (largest tertiary market in SEA, regulatory shape similar to Malaysia, ASEAN integration tailwinds) and Singapore (credibility and reference customers).</w:t>
       </w:r>
     </w:p>
     <w:p>
@@ -4053,7 +4096,7 @@
               <w:spacing w:after="0"/>
             </w:pPr>
             <w:r>
-              <w:t xml:space="preserve">Soft Launch — UM (starting market)</w:t>
+              <w:t xml:space="preserve">Soft Launch: UM (starting market)</w:t>
             </w:r>
           </w:p>
         </w:tc>
@@ -4103,7 +4146,7 @@
               <w:spacing w:after="0"/>
             </w:pPr>
             <w:r>
-              <w:t xml:space="preserve">Months 1–6</w:t>
+              <w:t xml:space="preserve">Months 1 to 6</w:t>
             </w:r>
           </w:p>
         </w:tc>
@@ -4205,7 +4248,7 @@
               <w:spacing w:after="0"/>
             </w:pPr>
             <w:r>
-              <w:t xml:space="preserve">Months 6–18</w:t>
+              <w:t xml:space="preserve">Months 6 to 18</w:t>
             </w:r>
           </w:p>
         </w:tc>
@@ -4307,7 +4350,7 @@
               <w:spacing w:after="0"/>
             </w:pPr>
             <w:r>
-              <w:t xml:space="preserve">Months 18–30</w:t>
+              <w:t xml:space="preserve">Months 18 to 30</w:t>
             </w:r>
           </w:p>
         </w:tc>
@@ -4332,7 +4375,7 @@
               <w:spacing w:after="0"/>
             </w:pPr>
             <w:r>
-              <w:t xml:space="preserve">~140,000 active students across 8+ unis</w:t>
+              <w:t xml:space="preserve">~140,000 active students across 8 plus unis</w:t>
             </w:r>
           </w:p>
         </w:tc>
@@ -4409,7 +4452,7 @@
               <w:spacing w:after="0"/>
             </w:pPr>
             <w:r>
-              <w:t xml:space="preserve">Months 30–48</w:t>
+              <w:t xml:space="preserve">Months 30 to 48</w:t>
             </w:r>
           </w:p>
         </w:tc>
@@ -4490,7 +4533,7 @@
               <w:spacing w:after="0"/>
             </w:pPr>
             <w:r>
-              <w:t xml:space="preserve">Approximately RM 4.2M total investment over 4 years (engineering + customer success + sales + infrastructure).</w:t>
+              <w:t xml:space="preserve">Approximately RM 4.2M total investment over 4 years (engineering, customer success, sales, infrastructure).</w:t>
             </w:r>
           </w:p>
         </w:tc>
@@ -4548,7 +4591,7 @@
                 <w:b/>
                 <w:bCs/>
               </w:rPr>
-              <w:t xml:space="preserve">MY full coverage + ID/SG entry</w:t>
+              <w:t xml:space="preserve">MY full coverage plus ID/SG entry</w:t>
             </w:r>
           </w:p>
         </w:tc>
@@ -5641,7 +5684,7 @@
               <w:spacing w:after="0"/>
             </w:pPr>
             <w:r>
-              <w:t xml:space="preserve">Engineering + hosting + CS</w:t>
+              <w:t xml:space="preserve">Engineering, hosting, CS</w:t>
             </w:r>
           </w:p>
         </w:tc>
@@ -5918,7 +5961,7 @@
         <w:t xml:space="preserve">Month 36: </w:t>
       </w:r>
       <w:r>
-        <w:t xml:space="preserve">Eight institutions live; ~140,000 active students; net position approximately RM +500,000; expansion to Indonesia + Singapore programmed for Year 4.</w:t>
+        <w:t xml:space="preserve">Eight institutions live; ~140,000 active students; net position approximately RM +500,000; expansion to Indonesia and Singapore programmed for Year 4.</w:t>
       </w:r>
     </w:p>
     <w:p>
@@ -5932,7 +5975,7 @@
           <w:iCs/>
           <w:color w:val="808080"/>
         </w:rPr>
-        <w:t xml:space="preserve">— End of Business Proposal —</w:t>
+        <w:t xml:space="preserve">End of Business Proposal</w:t>
       </w:r>
     </w:p>
     <w:sectPr>

</xml_diff>